<commit_message>
fix dang nhap + merge nhanh Longg, Tun
</commit_message>
<xml_diff>
--- a/Document/0.Mở đầu.docx
+++ b/Document/0.Mở đầu.docx
@@ -1126,10 +1126,8 @@
           <w:bottom w:val="thinThickThinSmallGap" w:sz="24" w:space="1" w:color="auto"/>
           <w:right w:val="thinThickThinSmallGap" w:sz="24" w:space="4" w:color="auto"/>
         </w:pBdr>
-        <w:jc w:val="center"/>
-        <w:rPr>
-          <w:rFonts w:ascii="Times New Roman" w:hAnsi="Times New Roman" w:cs="Times New Roman"/>
-          <w:b/>
+        <w:rPr>
+          <w:rFonts w:ascii="Times New Roman" w:hAnsi="Times New Roman" w:cs="Times New Roman"/>
           <w:sz w:val="32"/>
           <w:szCs w:val="32"/>
         </w:rPr>
@@ -1146,35 +1144,18 @@
         <w:jc w:val="center"/>
         <w:rPr>
           <w:rFonts w:ascii="Times New Roman" w:hAnsi="Times New Roman" w:cs="Times New Roman"/>
+          <w:b/>
+          <w:sz w:val="40"/>
+          <w:szCs w:val="40"/>
+        </w:rPr>
+      </w:pPr>
+      <w:proofErr w:type="spellStart"/>
+      <w:r>
+        <w:rPr>
+          <w:rFonts w:ascii="Times New Roman" w:hAnsi="Times New Roman" w:cs="Times New Roman"/>
           <w:sz w:val="32"/>
           <w:szCs w:val="32"/>
         </w:rPr>
-      </w:pPr>
-    </w:p>
-    <w:p>
-      <w:pPr>
-        <w:pBdr>
-          <w:top w:val="thinThickThinSmallGap" w:sz="24" w:space="1" w:color="auto"/>
-          <w:left w:val="thinThickThinSmallGap" w:sz="24" w:space="4" w:color="auto"/>
-          <w:bottom w:val="thinThickThinSmallGap" w:sz="24" w:space="1" w:color="auto"/>
-          <w:right w:val="thinThickThinSmallGap" w:sz="24" w:space="4" w:color="auto"/>
-        </w:pBdr>
-        <w:jc w:val="center"/>
-        <w:rPr>
-          <w:rFonts w:ascii="Times New Roman" w:hAnsi="Times New Roman" w:cs="Times New Roman"/>
-          <w:b/>
-          <w:sz w:val="40"/>
-          <w:szCs w:val="40"/>
-        </w:rPr>
-      </w:pPr>
-      <w:proofErr w:type="spellStart"/>
-      <w:r>
-        <w:rPr>
-          <w:rFonts w:ascii="Times New Roman" w:hAnsi="Times New Roman" w:cs="Times New Roman"/>
-          <w:sz w:val="32"/>
-          <w:szCs w:val="32"/>
-        </w:rPr>
-        <w:lastRenderedPageBreak/>
         <w:t>Đà</w:t>
       </w:r>
       <w:proofErr w:type="spellEnd"/>
@@ -3039,34 +3020,14 @@
         </w:rPr>
         <w:t xml:space="preserve"> </w:t>
       </w:r>
-      <w:proofErr w:type="spellStart"/>
-      <w:r>
-        <w:rPr>
-          <w:rFonts w:ascii="Times New Roman" w:hAnsi="Times New Roman" w:cs="Times New Roman"/>
-          <w:sz w:val="26"/>
-          <w:szCs w:val="26"/>
-        </w:rPr>
-        <w:t>Nguyễn</w:t>
-      </w:r>
-      <w:proofErr w:type="spellEnd"/>
-      <w:r>
-        <w:rPr>
-          <w:rFonts w:ascii="Times New Roman" w:hAnsi="Times New Roman" w:cs="Times New Roman"/>
-          <w:sz w:val="26"/>
-          <w:szCs w:val="26"/>
-        </w:rPr>
-        <w:t xml:space="preserve"> Minh </w:t>
-      </w:r>
-      <w:proofErr w:type="spellStart"/>
-      <w:r>
-        <w:rPr>
-          <w:rFonts w:ascii="Times New Roman" w:hAnsi="Times New Roman" w:cs="Times New Roman"/>
-          <w:sz w:val="26"/>
-          <w:szCs w:val="26"/>
-        </w:rPr>
-        <w:t>Nhật</w:t>
-      </w:r>
-      <w:proofErr w:type="spellEnd"/>
+      <w:r>
+        <w:rPr>
+          <w:rFonts w:ascii="Times New Roman" w:hAnsi="Times New Roman" w:cs="Times New Roman"/>
+          <w:sz w:val="26"/>
+          <w:szCs w:val="26"/>
+        </w:rPr>
+        <w:t>Phan Long</w:t>
+      </w:r>
       <w:r>
         <w:rPr>
           <w:rFonts w:ascii="Times New Roman" w:hAnsi="Times New Roman" w:cs="Times New Roman"/>
@@ -6194,39 +6155,17 @@
           <w:sz w:val="26"/>
           <w:szCs w:val="26"/>
         </w:rPr>
-        <w:t xml:space="preserve">. </w:t>
-      </w:r>
-      <w:proofErr w:type="spellStart"/>
-      <w:r>
-        <w:rPr>
-          <w:rFonts w:ascii="Times New Roman" w:hAnsi="Times New Roman" w:cs="Times New Roman"/>
-          <w:i/>
-          <w:sz w:val="26"/>
-          <w:szCs w:val="26"/>
-        </w:rPr>
-        <w:t>Nguyễn</w:t>
-      </w:r>
-      <w:proofErr w:type="spellEnd"/>
-      <w:r>
-        <w:rPr>
-          <w:rFonts w:ascii="Times New Roman" w:hAnsi="Times New Roman" w:cs="Times New Roman"/>
-          <w:i/>
-          <w:sz w:val="26"/>
-          <w:szCs w:val="26"/>
-        </w:rPr>
-        <w:t xml:space="preserve"> Minh </w:t>
-      </w:r>
-      <w:proofErr w:type="spellStart"/>
-      <w:r>
-        <w:rPr>
-          <w:rFonts w:ascii="Times New Roman" w:hAnsi="Times New Roman" w:cs="Times New Roman"/>
-          <w:i/>
-          <w:sz w:val="26"/>
-          <w:szCs w:val="26"/>
-        </w:rPr>
-        <w:t>Nhật</w:t>
-      </w:r>
-      <w:proofErr w:type="spellEnd"/>
+        <w:t>.</w:t>
+      </w:r>
+      <w:r>
+        <w:rPr>
+          <w:rFonts w:ascii="Times New Roman" w:hAnsi="Times New Roman" w:cs="Times New Roman"/>
+          <w:i/>
+          <w:sz w:val="26"/>
+          <w:szCs w:val="26"/>
+        </w:rPr>
+        <w:t xml:space="preserve"> Phan Long</w:t>
+      </w:r>
     </w:p>
     <w:p>
       <w:pPr>

</xml_diff>